<commit_message>
docs(doi-buoi): api-contract muc 12 + huong dan ho tro tab Thong ke
Khong migration.

Co-Authored-By: Claude Opus 5.5 <noreply@anthropic.com>
</commit_message>
<xml_diff>
--- a/docs/huong-dan-doi-buoi-ho-tro.docx
+++ b/docs/huong-dan-doi-buoi-ho-tro.docx
@@ -731,6 +731,169 @@
       </w:r>
       <w:r>
         <w:t xml:space="preserve"> (Quản trị vẫn làm được, kèm cảnh báo).</w:t>
+      </w:r>
+    </w:p>
+    <w:p>
+      <w:pPr>
+        <w:pStyle w:val="Heading3"/>
+        <w:jc w:val="left"/>
+      </w:pPr>
+      <w:r>
+        <w:t xml:space="preserve">Tab </w:t>
+      </w:r>
+      <w:r>
+        <w:rPr>
+          <w:b/>
+          <w:bCs/>
+        </w:rPr>
+        <w:t xml:space="preserve">Thống kê</w:t>
+      </w:r>
+    </w:p>
+    <w:p>
+      <w:r>
+        <w:t xml:space="preserve">Mỗi dòng là </w:t>
+      </w:r>
+      <w:r>
+        <w:rPr>
+          <w:b/>
+          <w:bCs/>
+        </w:rPr>
+        <w:t xml:space="preserve">một buổi học</w:t>
+      </w:r>
+      <w:r>
+        <w:t xml:space="preserve"> có học viên xin đổi ra hoặc đổi vào. Lọc theo khóa, giai đoạn, lớp, trình độ, hình thức,</w:t>
+      </w:r>
+    </w:p>
+    <w:p>
+      <w:r>
+        <w:t xml:space="preserve">cụm (người hỗ trợ chỉ thấy cụm mình), khoảng ngày học; bật </w:t>
+      </w:r>
+      <w:r>
+        <w:rPr>
+          <w:b/>
+          <w:bCs/>
+        </w:rPr>
+        <w:t xml:space="preserve">Chỉ buổi có đề nghị chờ</w:t>
+      </w:r>
+      <w:r>
+        <w:t xml:space="preserve"> để chỉ xem buổi còn việc cần duyệt.</w:t>
+      </w:r>
+    </w:p>
+    <w:p>
+      <w:pPr>
+        <w:pStyle w:val="ListParagraph"/>
+        <w:numPr>
+          <w:ilvl w:val="0"/>
+          <w:numId w:val="2"/>
+        </w:numPr>
+      </w:pPr>
+      <w:r>
+        <w:t xml:space="preserve">Hàng ô trên cùng: tổng đề nghị, chờ duyệt, quá hạn, đã duyệt, từ chối, đã hủy, số buổi đã đầy.</w:t>
+      </w:r>
+    </w:p>
+    <w:p>
+      <w:pPr>
+        <w:pStyle w:val="ListParagraph"/>
+        <w:numPr>
+          <w:ilvl w:val="0"/>
+          <w:numId w:val="2"/>
+        </w:numPr>
+      </w:pPr>
+      <w:r>
+        <w:t xml:space="preserve">Cột </w:t>
+      </w:r>
+      <w:r>
+        <w:rPr>
+          <w:b/>
+          <w:bCs/>
+        </w:rPr>
+        <w:t xml:space="preserve">Sĩ số</w:t>
+      </w:r>
+      <w:r>
+        <w:t xml:space="preserve">: </w:t>
+      </w:r>
+      <w:r>
+        <w:rPr>
+          <w:i/>
+          <w:iCs/>
+        </w:rPr>
+        <w:t xml:space="preserve">phân lớp → sau đổi / tối đa</w:t>
+      </w:r>
+      <w:r>
+        <w:t xml:space="preserve"> (đỏ = buổi đã đầy).</w:t>
+      </w:r>
+    </w:p>
+    <w:p>
+      <w:pPr>
+        <w:pStyle w:val="ListParagraph"/>
+        <w:numPr>
+          <w:ilvl w:val="0"/>
+          <w:numId w:val="2"/>
+        </w:numPr>
+      </w:pPr>
+      <w:r>
+        <w:t xml:space="preserve">Cột </w:t>
+      </w:r>
+      <w:r>
+        <w:rPr>
+          <w:b/>
+          <w:bCs/>
+        </w:rPr>
+        <w:t xml:space="preserve">Đổi ra / Đổi vào</w:t>
+      </w:r>
+      <w:r>
+        <w:t xml:space="preserve">: 5 số </w:t>
+      </w:r>
+      <w:r>
+        <w:rPr>
+          <w:i/>
+          <w:iCs/>
+        </w:rPr>
+        <w:t xml:space="preserve">duyệt · chờ · quá hạn · từ chối · hủy</w:t>
+      </w:r>
+      <w:r>
+        <w:t xml:space="preserve">.</w:t>
+      </w:r>
+    </w:p>
+    <w:p>
+      <w:pPr>
+        <w:pStyle w:val="ListParagraph"/>
+        <w:numPr>
+          <w:ilvl w:val="0"/>
+          <w:numId w:val="2"/>
+        </w:numPr>
+      </w:pPr>
+      <w:r>
+        <w:t xml:space="preserve">Bấm một dòng để xem danh sách học viên đổi ra / đổi vào của buổi đó.</w:t>
+      </w:r>
+    </w:p>
+    <w:p>
+      <w:pPr>
+        <w:pStyle w:val="ListParagraph"/>
+        <w:numPr>
+          <w:ilvl w:val="0"/>
+          <w:numId w:val="2"/>
+        </w:numPr>
+      </w:pPr>
+      <w:r>
+        <w:rPr>
+          <w:b/>
+          <w:bCs/>
+        </w:rPr>
+        <w:t xml:space="preserve">Xuất Excel</w:t>
+      </w:r>
+      <w:r>
+        <w:t xml:space="preserve">: tải bảng đang lọc kèm sheet danh sách học viên (có họ tên, đơn vị — </w:t>
+      </w:r>
+      <w:r>
+        <w:rPr>
+          <w:b/>
+          <w:bCs/>
+        </w:rPr>
+        <w:t xml:space="preserve">không chuyển ra ngoài</w:t>
+      </w:r>
+      <w:r>
+        <w:t xml:space="preserve">).</w:t>
       </w:r>
     </w:p>
     <w:p>

</xml_diff>

<commit_message>
docs(doi-buoi): ADR 0007 D11 doi lai + D8 luot theo buoi nguon, spec, api-contract, huong dan, runbook
CO migration 20261016170000_doi_buoi_tach_rang_buoc (chi doi index) - runbook
docs/deploy/2026-10-16-doi-buoi-doi-lai.md: backup, deploy 06, kiem \d doi_buoi_hoc,
rollback dao index (chi khi khong co cap nao co ca cho + da duyet).
Tao lai 2 file .docx huong dan.

Co-Authored-By: Claude Opus 5.5 <noreply@anthropic.com>
</commit_message>
<xml_diff>
--- a/docs/huong-dan-doi-buoi-ho-tro.docx
+++ b/docs/huong-dan-doi-buoi-ho-tro.docx
@@ -686,6 +686,90 @@
       </w:r>
     </w:p>
     <w:p>
+      <w:r>
+        <w:rPr>
+          <w:b/>
+          <w:bCs/>
+        </w:rPr>
+        <w:t xml:space="preserve">Đổi lại</w:t>
+      </w:r>
+      <w:r>
+        <w:t xml:space="preserve">: thẻ có nhãn </w:t>
+      </w:r>
+      <w:r>
+        <w:rPr>
+          <w:b/>
+          <w:bCs/>
+        </w:rPr>
+        <w:t xml:space="preserve">Đổi lại</w:t>
+      </w:r>
+      <w:r>
+        <w:t xml:space="preserve"> và khối </w:t>
+      </w:r>
+      <w:r>
+        <w:rPr>
+          <w:b/>
+          <w:bCs/>
+        </w:rPr>
+        <w:t xml:space="preserve">Đang học</w:t>
+      </w:r>
+      <w:r>
+        <w:t xml:space="preserve"> là học viên xin đổi tiếp một đề nghị </w:t>
+      </w:r>
+      <w:r>
+        <w:rPr>
+          <w:i/>
+          <w:iCs/>
+        </w:rPr>
+        <w:t xml:space="preserve">đã duyệt</w:t>
+      </w:r>
+      <w:r>
+        <w:t xml:space="preserve">.</w:t>
+      </w:r>
+    </w:p>
+    <w:p>
+      <w:r>
+        <w:t xml:space="preserve">Cửa sổ duyệt ghi </w:t>
+      </w:r>
+      <w:r>
+        <w:rPr>
+          <w:i/>
+          <w:iCs/>
+        </w:rPr>
+        <w:t xml:space="preserve">Duyệt sẽ thay buổi đang học</w:t>
+      </w:r>
+      <w:r>
+        <w:t xml:space="preserve">: duyệt thì buổi mới thay buổi đang học (đề nghị cũ chuyển *Đã thay</w:t>
+      </w:r>
+    </w:p>
+    <w:p>
+      <w:r>
+        <w:t xml:space="preserve">bằng đề nghị đổi lại</w:t>
+      </w:r>
+      <w:r>
+        <w:rPr>
+          <w:i/>
+          <w:iCs/>
+        </w:rPr>
+        <w:t xml:space="preserve">, không tốn thêm lượt của học viên); </w:t>
+      </w:r>
+      <w:r>
+        <w:rPr>
+          <w:i/>
+          <w:iCs/>
+        </w:rPr>
+        <w:t xml:space="preserve">từ chối</w:t>
+      </w:r>
+      <w:r>
+        <w:t xml:space="preserve">* thì học viên vẫn học buổi đã duyệt trước đó.</w:t>
+      </w:r>
+    </w:p>
+    <w:p>
+      <w:r>
+        <w:t xml:space="preserve">Buổi đang học không có trong danh sách chọn buổi chốt.</w:t>
+      </w:r>
+    </w:p>
+    <w:p>
       <w:pPr>
         <w:pStyle w:val="Heading3"/>
         <w:jc w:val="left"/>
@@ -703,7 +787,22 @@
     </w:p>
     <w:p>
       <w:r>
-        <w:t xml:space="preserve">Xem đề nghị đã duyệt / từ chối / hủy, buổi chốt, người xử lý, ghi chú.</w:t>
+        <w:t xml:space="preserve">Xem đề nghị đã duyệt / từ chối / hủy, buổi chốt, người xử lý, ghi chú. Nhãn </w:t>
+      </w:r>
+      <w:r>
+        <w:rPr>
+          <w:i/>
+          <w:iCs/>
+        </w:rPr>
+        <w:t xml:space="preserve">Đã thay bằng đề nghị đổi lại</w:t>
+      </w:r>
+      <w:r>
+        <w:t xml:space="preserve"> = bản</w:t>
+      </w:r>
+    </w:p>
+    <w:p>
+      <w:r>
+        <w:t xml:space="preserve">đã duyệt được thay khi duyệt đề nghị đổi lại (hệ thống tự ghi, không phải ai hủy).</w:t>
       </w:r>
     </w:p>
     <w:p>

</xml_diff>

<commit_message>
feat(doi-buoi): UI canh bao trung gio (hoc vien + nguoi duyet) + docs
- CanhBaoTrungLich: 1 dong chu cam, toi da 2 buoi roi "+k buoi khac"
- DeNghiDoiBuoi: canh bao duoi tung lua chon; gui buoi trung -> modal
  "Chon buoi khac" / "Van gui"
- DuyetDoiBuoi: canh bao tren the cho duyet + tung lua chon trong cua so Duyet
- api-contract §12 (trung_lich), huong dan hoc vien/ho tro + docx
- Khong migration.

Co-Authored-By: Claude Opus 5.5 <noreply@anthropic.com>
</commit_message>
<xml_diff>
--- a/docs/huong-dan-doi-buoi-ho-tro.docx
+++ b/docs/huong-dan-doi-buoi-ho-tro.docx
@@ -619,6 +619,28 @@
       </w:r>
       <w:r>
         <w:t xml:space="preserve">.</w:t>
+      </w:r>
+    </w:p>
+    <w:p>
+      <w:r>
+        <w:rPr>
+          <w:b/>
+          <w:bCs/>
+        </w:rPr>
+        <w:t xml:space="preserve">Trùng giờ</w:t>
+      </w:r>
+      <w:r>
+        <w:t xml:space="preserve">: dòng chữ cam </w:t>
+      </w:r>
+      <w:r>
+        <w:rPr>
+          <w:i/>
+          <w:iCs/>
+        </w:rPr>
+        <w:t xml:space="preserve">⚠ Trùng giờ với Buổi … · lớp … · ngày giờ</w:t>
+      </w:r>
+      <w:r>
+        <w:t xml:space="preserve"> (trên thẻ chờ duyệt và dưới từng lựa chọn trong cửa sổ Duyệt) = buổi đó trùng giờ một buổi khác học viên đang học. Chỉ là cảnh báo — vẫn duyệt được; nên trao đổi với học viên trước.</w:t>
       </w:r>
     </w:p>
     <w:p>

</xml_diff>

<commit_message>
feat(doi-buoi): da diem danh thi khong doi / khong huy duyet (ADR 0007 D12)
Diem danh Zoom mo truoc gio hoc nen chan theo thoi gian chua du. Hoc vien
da co dong diem_danh o buoi nguon (hoac buoi dang hoc khi doi lai) thi
gui/sua/lua-chon/duyet tra 400 DA_DIEM_DANH; de nghi cho nhu vay tinh qua han
(idQuaHanThem: 1 truy van gop). Huy duyet bi chan khi da diem danh o buoi chot.
FE an link doi buoi / doi lai khi buoi da co trang_thai_diem_danh.

Khong migration, khong doi du lieu.

Co-Authored-By: Claude Opus 5.5 <noreply@anthropic.com>
</commit_message>
<xml_diff>
--- a/docs/huong-dan-doi-buoi-ho-tro.docx
+++ b/docs/huong-dan-doi-buoi-ho-tro.docx
@@ -705,6 +705,48 @@
       </w:r>
       <w:r>
         <w:t xml:space="preserve"> để đóng.</w:t>
+      </w:r>
+    </w:p>
+    <w:p>
+      <w:r>
+        <w:rPr>
+          <w:b/>
+          <w:bCs/>
+        </w:rPr>
+        <w:t xml:space="preserve">Đã điểm danh</w:t>
+      </w:r>
+      <w:r>
+        <w:t xml:space="preserve">: học viên đã có điểm danh ở buổi gốc hoặc buổi đang học (kể cả điểm danh Zoom mở trước giờ) thì đề nghị cũng vào </w:t>
+      </w:r>
+      <w:r>
+        <w:rPr>
+          <w:b/>
+          <w:bCs/>
+        </w:rPr>
+        <w:t xml:space="preserve">Quá hạn</w:t>
+      </w:r>
+      <w:r>
+        <w:t xml:space="preserve">, không duyệt được (</w:t>
+      </w:r>
+      <w:r>
+        <w:rPr>
+          <w:i/>
+          <w:iCs/>
+        </w:rPr>
+        <w:t xml:space="preserve">Học viên đã điểm danh buổi này, không thể đổi</w:t>
+      </w:r>
+      <w:r>
+        <w:t xml:space="preserve">); đề nghị đã duyệt mà học viên đã điểm danh ở buổi chốt thì không </w:t>
+      </w:r>
+      <w:r>
+        <w:rPr>
+          <w:b/>
+          <w:bCs/>
+        </w:rPr>
+        <w:t xml:space="preserve">Hủy duyệt</w:t>
+      </w:r>
+      <w:r>
+        <w:t xml:space="preserve"> được.</w:t>
       </w:r>
     </w:p>
     <w:p>
@@ -1648,6 +1690,98 @@
                 <w:szCs w:val="24"/>
               </w:rPr>
               <w:t xml:space="preserve">Cần nhắc lại</w:t>
+            </w:r>
+          </w:p>
+        </w:tc>
+      </w:tr>
+      <w:tr>
+        <w:tc>
+          <w:tcPr>
+            <w:tcW w:type="dxa" w:w="3175"/>
+            <w:tcBorders>
+              <w:top w:val="single" w:color="000000" w:sz="4"/>
+              <w:left w:val="single" w:color="000000" w:sz="4"/>
+              <w:bottom w:val="single" w:color="000000" w:sz="4"/>
+              <w:right w:val="single" w:color="000000" w:sz="4"/>
+            </w:tcBorders>
+            <w:tcMar>
+              <w:top w:type="dxa" w:w="60"/>
+              <w:left w:type="dxa" w:w="100"/>
+              <w:bottom w:type="dxa" w:w="60"/>
+              <w:right w:type="dxa" w:w="100"/>
+            </w:tcMar>
+          </w:tcPr>
+          <w:p>
+            <w:pPr>
+              <w:spacing w:after="0" w:before="0"/>
+            </w:pPr>
+            <w:r>
+              <w:rPr>
+                <w:sz w:val="24"/>
+                <w:szCs w:val="24"/>
+              </w:rPr>
+              <w:t xml:space="preserve">Người hỗ trợ lớp đích</w:t>
+            </w:r>
+          </w:p>
+        </w:tc>
+        <w:tc>
+          <w:tcPr>
+            <w:tcW w:type="dxa" w:w="5896"/>
+            <w:tcBorders>
+              <w:top w:val="single" w:color="000000" w:sz="4"/>
+              <w:left w:val="single" w:color="000000" w:sz="4"/>
+              <w:bottom w:val="single" w:color="000000" w:sz="4"/>
+              <w:right w:val="single" w:color="000000" w:sz="4"/>
+            </w:tcBorders>
+            <w:tcMar>
+              <w:top w:type="dxa" w:w="60"/>
+              <w:left w:type="dxa" w:w="100"/>
+              <w:bottom w:type="dxa" w:w="60"/>
+              <w:right w:type="dxa" w:w="100"/>
+            </w:tcMar>
+          </w:tcPr>
+          <w:p>
+            <w:pPr>
+              <w:spacing w:after="0" w:before="0"/>
+            </w:pPr>
+            <w:r>
+              <w:rPr>
+                <w:sz w:val="24"/>
+                <w:szCs w:val="24"/>
+              </w:rPr>
+              <w:t xml:space="preserve">Học viên đổi vào thuộc phạm vi của người hỗ trợ lớp đích (cùng với người hỗ trợ lớp gốc và cụm): mở hồ sơ, sửa thông tin, cấp lại mật khẩu, trả lời </w:t>
+            </w:r>
+            <w:r>
+              <w:rPr>
+                <w:b/>
+                <w:bCs/>
+                <w:sz w:val="24"/>
+                <w:szCs w:val="24"/>
+              </w:rPr>
+              <w:t xml:space="preserve">Yêu cầu hỗ trợ</w:t>
+            </w:r>
+            <w:r>
+              <w:rPr>
+                <w:sz w:val="24"/>
+                <w:szCs w:val="24"/>
+              </w:rPr>
+              <w:t xml:space="preserve"> (ký "Hỗ trợ lớp {lớp}"), xem </w:t>
+            </w:r>
+            <w:r>
+              <w:rPr>
+                <w:b/>
+                <w:bCs/>
+                <w:sz w:val="24"/>
+                <w:szCs w:val="24"/>
+              </w:rPr>
+              <w:t xml:space="preserve">Tình hình đi học</w:t>
+            </w:r>
+            <w:r>
+              <w:rPr>
+                <w:sz w:val="24"/>
+                <w:szCs w:val="24"/>
+              </w:rPr>
+              <w:t xml:space="preserve">. Đề nghị chờ duyệt / bị từ chối / bị hủy không tính</w:t>
             </w:r>
           </w:p>
         </w:tc>

</xml_diff>

<commit_message>
feat(hoc-bu): giao dien + e2e + tai lieu (khong migration)
- Hoc vien: link "Dang ky hoc bu buoi nay?" (hoc_bu_duoc), nhan Hoc bu tren o hoc bu,
  trang /de-nghi-doi-buoi?loai=hoc_bu (luot rieng, Buoi da vang, gui loai).
- Nguoi duyet: badge Hoc bu, khoi Buoi da vang, loc Loai; thong ke loc loai + vao_hoc_bu;
  Quan tri: o so buoi hoc bu toi da (0-50).
- Fix review: DanhSachTheoBuoi giu nguoi hoc bu o buoi goc; an link doi buoi o o hoc bu;
  ho so HV hien o hoc bu; lich hoc ho tro hien hoc_vien_hoc_bu; tinh hinh di hoc nhan hoc bu
  (doi_buoi.hoc_bu); hoc_bu_duoc khong bi chan boi hoc bu cho da qua han; Excel
  "Hoc bu vao (da duyet)".
- E2E (g) hoc bu; api-contract 12.5; huong dan + docx; runbook 2026-10-19-hoc-bu; ADR 0012 Da chap nhan.

Khong migration moi (migration 20261019120000_hoc_bu da co o 8f7b264).

Co-Authored-By: Claude Opus 5.5 <noreply@anthropic.com>
</commit_message>
<xml_diff>
--- a/docs/huong-dan-doi-buoi-ho-tro.docx
+++ b/docs/huong-dan-doi-buoi-ho-tro.docx
@@ -8,7 +8,7 @@
         <w:jc w:val="center"/>
       </w:pPr>
       <w:r>
-        <w:t xml:space="preserve">Hướng dẫn đội hỗ trợ — Duyệt đề nghị đổi buổi học</w:t>
+        <w:t xml:space="preserve">Hướng dẫn đội hỗ trợ — Duyệt đề nghị đổi buổi học và học bù</w:t>
       </w:r>
     </w:p>
     <w:p>
@@ -2382,6 +2382,513 @@
       </w:tr>
     </w:tbl>
     <w:p/>
+    <w:p>
+      <w:pPr>
+        <w:pStyle w:val="Heading2"/>
+        <w:jc w:val="left"/>
+      </w:pPr>
+      <w:r>
+        <w:t xml:space="preserve">6. Học bù buổi đã vắng (ADR 0012)</w:t>
+      </w:r>
+    </w:p>
+    <w:p>
+      <w:r>
+        <w:t xml:space="preserve">Học viên </w:t>
+      </w:r>
+      <w:r>
+        <w:rPr>
+          <w:b/>
+          <w:bCs/>
+        </w:rPr>
+        <w:t xml:space="preserve">đã vắng</w:t>
+      </w:r>
+      <w:r>
+        <w:t xml:space="preserve"> một buổi (buổi đã diễn ra, không có mặt) đăng ký học bù ở buổi tương đương </w:t>
+      </w:r>
+      <w:r>
+        <w:rPr>
+          <w:b/>
+          <w:bCs/>
+        </w:rPr>
+        <w:t xml:space="preserve">chưa bắt đầu</w:t>
+      </w:r>
+      <w:r>
+        <w:t xml:space="preserve"> của lớp khác.</w:t>
+      </w:r>
+    </w:p>
+    <w:p>
+      <w:r>
+        <w:t xml:space="preserve">Dùng chung màn </w:t>
+      </w:r>
+      <w:r>
+        <w:rPr>
+          <w:b/>
+          <w:bCs/>
+        </w:rPr>
+        <w:t xml:space="preserve">Đổi buổi</w:t>
+      </w:r>
+      <w:r>
+        <w:t xml:space="preserve">, hàng chờ, sĩ số, cửa sổ duyệt.</w:t>
+      </w:r>
+    </w:p>
+    <w:p>
+      <w:pPr>
+        <w:pStyle w:val="ListParagraph"/>
+        <w:numPr>
+          <w:ilvl w:val="0"/>
+          <w:numId w:val="2"/>
+        </w:numPr>
+      </w:pPr>
+      <w:r>
+        <w:rPr>
+          <w:b/>
+          <w:bCs/>
+        </w:rPr>
+        <w:t xml:space="preserve">Bật</w:t>
+      </w:r>
+      <w:r>
+        <w:t xml:space="preserve">: Quản trị → trang khóa → ô </w:t>
+      </w:r>
+      <w:r>
+        <w:rPr>
+          <w:b/>
+          <w:bCs/>
+        </w:rPr>
+        <w:t xml:space="preserve">Số buổi học bù tối đa mỗi học viên (0 = tắt)</w:t>
+      </w:r>
+      <w:r>
+        <w:t xml:space="preserve"> (0–50) → </w:t>
+      </w:r>
+      <w:r>
+        <w:rPr>
+          <w:b/>
+          <w:bCs/>
+        </w:rPr>
+        <w:t xml:space="preserve">Lưu số buổi học bù</w:t>
+      </w:r>
+      <w:r>
+        <w:t xml:space="preserve">.</w:t>
+      </w:r>
+    </w:p>
+    <w:p>
+      <w:pPr>
+        <w:ind w:left="720"/>
+      </w:pPr>
+      <w:r>
+        <w:t xml:space="preserve">Lượt học bù </w:t>
+      </w:r>
+      <w:r>
+        <w:rPr>
+          <w:b/>
+          <w:bCs/>
+        </w:rPr>
+        <w:t xml:space="preserve">tách riêng</w:t>
+      </w:r>
+      <w:r>
+        <w:t xml:space="preserve"> lượt đổi buổi. Sau khi triển khai, mọi khóa đều </w:t>
+      </w:r>
+      <w:r>
+        <w:rPr>
+          <w:b/>
+          <w:bCs/>
+        </w:rPr>
+        <w:t xml:space="preserve">tắt</w:t>
+      </w:r>
+      <w:r>
+        <w:t xml:space="preserve"> cho tới khi Quản trị nhập số.</w:t>
+      </w:r>
+    </w:p>
+    <w:p>
+      <w:pPr>
+        <w:pStyle w:val="ListParagraph"/>
+        <w:numPr>
+          <w:ilvl w:val="0"/>
+          <w:numId w:val="2"/>
+        </w:numPr>
+      </w:pPr>
+      <w:r>
+        <w:rPr>
+          <w:b/>
+          <w:bCs/>
+        </w:rPr>
+        <w:t xml:space="preserve">Học viên vào từ</w:t>
+      </w:r>
+      <w:r>
+        <w:t xml:space="preserve">: dòng </w:t>
+      </w:r>
+      <w:r>
+        <w:rPr>
+          <w:i/>
+          <w:iCs/>
+        </w:rPr>
+        <w:t xml:space="preserve">Đăng ký học bù buổi này?</w:t>
+      </w:r>
+      <w:r>
+        <w:t xml:space="preserve"> dưới buổi đã vắng, hoặc link </w:t>
+      </w:r>
+      <w:r>
+        <w:rPr>
+          <w:rFonts w:ascii="Consolas" w:cs="Consolas" w:eastAsia="Consolas" w:hAnsi="Consolas"/>
+        </w:rPr>
+        <w:t xml:space="preserve">/de-nghi-doi-buoi?loai=hoc_bu</w:t>
+      </w:r>
+      <w:r>
+        <w:t xml:space="preserve">.</w:t>
+      </w:r>
+    </w:p>
+    <w:p>
+      <w:pPr>
+        <w:pStyle w:val="ListParagraph"/>
+        <w:numPr>
+          <w:ilvl w:val="0"/>
+          <w:numId w:val="2"/>
+        </w:numPr>
+      </w:pPr>
+      <w:r>
+        <w:rPr>
+          <w:b/>
+          <w:bCs/>
+        </w:rPr>
+        <w:t xml:space="preserve">Màn duyệt</w:t>
+      </w:r>
+      <w:r>
+        <w:t xml:space="preserve">: thẻ có nhãn </w:t>
+      </w:r>
+      <w:r>
+        <w:rPr>
+          <w:b/>
+          <w:bCs/>
+        </w:rPr>
+        <w:t xml:space="preserve">Học bù</w:t>
+      </w:r>
+      <w:r>
+        <w:t xml:space="preserve">, khối gốc ghi </w:t>
+      </w:r>
+      <w:r>
+        <w:rPr>
+          <w:b/>
+          <w:bCs/>
+        </w:rPr>
+        <w:t xml:space="preserve">Buổi đã vắng</w:t>
+      </w:r>
+      <w:r>
+        <w:t xml:space="preserve">, khối đích </w:t>
+      </w:r>
+      <w:r>
+        <w:rPr>
+          <w:b/>
+          <w:bCs/>
+        </w:rPr>
+        <w:t xml:space="preserve">Xin học bù tại</w:t>
+      </w:r>
+      <w:r>
+        <w:t xml:space="preserve">. Bộ lọc </w:t>
+      </w:r>
+      <w:r>
+        <w:rPr>
+          <w:b/>
+          <w:bCs/>
+        </w:rPr>
+        <w:t xml:space="preserve">Loại</w:t>
+      </w:r>
+    </w:p>
+    <w:p>
+      <w:pPr>
+        <w:ind w:left="720"/>
+      </w:pPr>
+      <w:r>
+        <w:t xml:space="preserve">(Tất cả / Đổi buổi / Học bù) ở trên tab Chờ duyệt và Đã xử lý.</w:t>
+      </w:r>
+    </w:p>
+    <w:p>
+      <w:pPr>
+        <w:pStyle w:val="ListParagraph"/>
+        <w:numPr>
+          <w:ilvl w:val="0"/>
+          <w:numId w:val="2"/>
+        </w:numPr>
+      </w:pPr>
+      <w:r>
+        <w:rPr>
+          <w:b/>
+          <w:bCs/>
+        </w:rPr>
+        <w:t xml:space="preserve">Khác đổi buổi</w:t>
+      </w:r>
+      <w:r>
+        <w:t xml:space="preserve">: buổi gốc đã qua không làm đề nghị quá hạn — chỉ quá hạn khi </w:t>
+      </w:r>
+      <w:r>
+        <w:rPr>
+          <w:b/>
+          <w:bCs/>
+        </w:rPr>
+        <w:t xml:space="preserve">buổi học bù</w:t>
+      </w:r>
+      <w:r>
+        <w:t xml:space="preserve"> đã bắt đầu.</w:t>
+      </w:r>
+    </w:p>
+    <w:p>
+      <w:pPr>
+        <w:ind w:left="720"/>
+      </w:pPr>
+      <w:r>
+        <w:t xml:space="preserve">Nếu học viên được ghi </w:t>
+      </w:r>
+      <w:r>
+        <w:rPr>
+          <w:b/>
+          <w:bCs/>
+        </w:rPr>
+        <w:t xml:space="preserve">có mặt</w:t>
+      </w:r>
+      <w:r>
+        <w:t xml:space="preserve"> ở buổi gốc sau khi gửi thì không duyệt được (</w:t>
+      </w:r>
+      <w:r>
+        <w:rPr>
+          <w:i/>
+          <w:iCs/>
+        </w:rPr>
+        <w:t xml:space="preserve">Học viên đã có mặt buổi này, không cần học bù</w:t>
+      </w:r>
+      <w:r>
+        <w:t xml:space="preserve">) — từ chối.</w:t>
+      </w:r>
+    </w:p>
+    <w:p>
+      <w:pPr>
+        <w:ind w:left="720"/>
+      </w:pPr>
+      <w:r>
+        <w:rPr>
+          <w:b/>
+          <w:bCs/>
+        </w:rPr>
+        <w:t xml:space="preserve">Hủy duyệt</w:t>
+      </w:r>
+      <w:r>
+        <w:t xml:space="preserve"> / đổi lại chỉ khi buổi học bù chưa bắt đầu và học viên chưa điểm danh ở buổi học bù.</w:t>
+      </w:r>
+    </w:p>
+    <w:p>
+      <w:pPr>
+        <w:pStyle w:val="ListParagraph"/>
+        <w:numPr>
+          <w:ilvl w:val="0"/>
+          <w:numId w:val="2"/>
+        </w:numPr>
+      </w:pPr>
+      <w:r>
+        <w:rPr>
+          <w:b/>
+          <w:bCs/>
+        </w:rPr>
+        <w:t xml:space="preserve">Sau khi duyệt</w:t>
+      </w:r>
+      <w:r>
+        <w:t xml:space="preserve">: lịch học viên </w:t>
+      </w:r>
+      <w:r>
+        <w:rPr>
+          <w:b/>
+          <w:bCs/>
+        </w:rPr>
+        <w:t xml:space="preserve">thêm</w:t>
+      </w:r>
+      <w:r>
+        <w:t xml:space="preserve"> buổi học bù (nhãn </w:t>
+      </w:r>
+      <w:r>
+        <w:rPr>
+          <w:b/>
+          <w:bCs/>
+        </w:rPr>
+        <w:t xml:space="preserve">Học bù</w:t>
+      </w:r>
+      <w:r>
+        <w:t xml:space="preserve">), buổi vắng vẫn ghi vắng; trang lớp gốc ghi</w:t>
+      </w:r>
+    </w:p>
+    <w:p>
+      <w:pPr>
+        <w:ind w:left="720"/>
+      </w:pPr>
+      <w:r>
+        <w:rPr>
+          <w:i/>
+          <w:iCs/>
+        </w:rPr>
+        <w:t xml:space="preserve">Học bù tại {lớp}</w:t>
+      </w:r>
+      <w:r>
+        <w:t xml:space="preserve"> (học viên </w:t>
+      </w:r>
+      <w:r>
+        <w:rPr>
+          <w:b/>
+          <w:bCs/>
+        </w:rPr>
+        <w:t xml:space="preserve">vẫn trong danh sách</w:t>
+      </w:r>
+      <w:r>
+        <w:t xml:space="preserve"> buổi gốc), lớp đích ghi </w:t>
+      </w:r>
+      <w:r>
+        <w:rPr>
+          <w:i/>
+          <w:iCs/>
+        </w:rPr>
+        <w:t xml:space="preserve">Học bù từ {lớp}</w:t>
+      </w:r>
+      <w:r>
+        <w:t xml:space="preserve">; </w:t>
+      </w:r>
+      <w:r>
+        <w:rPr>
+          <w:b/>
+          <w:bCs/>
+        </w:rPr>
+        <w:t xml:space="preserve">sĩ số buổi gốc không giảm</w:t>
+      </w:r>
+      <w:r>
+        <w:t xml:space="preserve">,</w:t>
+      </w:r>
+    </w:p>
+    <w:p>
+      <w:pPr>
+        <w:ind w:left="720"/>
+      </w:pPr>
+      <w:r>
+        <w:t xml:space="preserve">buổi học bù được cộng. Nạp điểm danh ở buổi học bù không bị báo học bù; có mặt ở buổi học bù tính có mặt cho buổi đã vắng</w:t>
+      </w:r>
+    </w:p>
+    <w:p>
+      <w:pPr>
+        <w:ind w:left="720"/>
+      </w:pPr>
+      <w:r>
+        <w:t xml:space="preserve">(chuyên cần, </w:t>
+      </w:r>
+      <w:r>
+        <w:rPr>
+          <w:b/>
+          <w:bCs/>
+        </w:rPr>
+        <w:t xml:space="preserve">Tình hình đi học</w:t>
+      </w:r>
+      <w:r>
+        <w:t xml:space="preserve"> ghi nhãn </w:t>
+      </w:r>
+      <w:r>
+        <w:rPr>
+          <w:b/>
+          <w:bCs/>
+        </w:rPr>
+        <w:t xml:space="preserve">Học bù</w:t>
+      </w:r>
+      <w:r>
+        <w:t xml:space="preserve">). Lịch học hỗ trợ ghi </w:t>
+      </w:r>
+      <w:r>
+        <w:rPr>
+          <w:i/>
+          <w:iCs/>
+        </w:rPr>
+        <w:t xml:space="preserve">Học bù vào: {họ tên}</w:t>
+      </w:r>
+      <w:r>
+        <w:t xml:space="preserve">.</w:t>
+      </w:r>
+    </w:p>
+    <w:p>
+      <w:pPr>
+        <w:pStyle w:val="ListParagraph"/>
+        <w:numPr>
+          <w:ilvl w:val="0"/>
+          <w:numId w:val="2"/>
+        </w:numPr>
+      </w:pPr>
+      <w:r>
+        <w:rPr>
+          <w:b/>
+          <w:bCs/>
+        </w:rPr>
+        <w:t xml:space="preserve">Thống kê</w:t>
+      </w:r>
+      <w:r>
+        <w:t xml:space="preserve">: lọc </w:t>
+      </w:r>
+      <w:r>
+        <w:rPr>
+          <w:b/>
+          <w:bCs/>
+        </w:rPr>
+        <w:t xml:space="preserve">Loại đề nghị</w:t>
+      </w:r>
+      <w:r>
+        <w:t xml:space="preserve">; cột </w:t>
+      </w:r>
+      <w:r>
+        <w:rPr>
+          <w:b/>
+          <w:bCs/>
+        </w:rPr>
+        <w:t xml:space="preserve">Đổi ra</w:t>
+      </w:r>
+      <w:r>
+        <w:t xml:space="preserve"> gồm cả học bù (người học bù vẫn thuộc buổi gốc nên sĩ số buổi đó không giảm);</w:t>
+      </w:r>
+    </w:p>
+    <w:p>
+      <w:pPr>
+        <w:ind w:left="720"/>
+      </w:pPr>
+      <w:r>
+        <w:t xml:space="preserve">dòng </w:t>
+      </w:r>
+      <w:r>
+        <w:rPr>
+          <w:i/>
+          <w:iCs/>
+        </w:rPr>
+        <w:t xml:space="preserve">Học bù đã duyệt: n</w:t>
+      </w:r>
+      <w:r>
+        <w:t xml:space="preserve"> dưới cột </w:t>
+      </w:r>
+      <w:r>
+        <w:rPr>
+          <w:b/>
+          <w:bCs/>
+        </w:rPr>
+        <w:t xml:space="preserve">Đổi vào</w:t>
+      </w:r>
+      <w:r>
+        <w:t xml:space="preserve">. Excel có cột </w:t>
+      </w:r>
+      <w:r>
+        <w:rPr>
+          <w:b/>
+          <w:bCs/>
+        </w:rPr>
+        <w:t xml:space="preserve">Học bù vào (đã duyệt)</w:t>
+      </w:r>
+      <w:r>
+        <w:t xml:space="preserve"> (sheet buổi) và </w:t>
+      </w:r>
+      <w:r>
+        <w:rPr>
+          <w:b/>
+          <w:bCs/>
+        </w:rPr>
+        <w:t xml:space="preserve">Loại</w:t>
+      </w:r>
+      <w:r>
+        <w:t xml:space="preserve"> (sheet học viên).</w:t>
+      </w:r>
+    </w:p>
     <w:sectPr>
       <w:pgSz w:w="11906" w:h="16838" w:orient="portrait"/>
       <w:pgMar w:top="1134" w:right="1134" w:bottom="1134" w:left="1701" w:header="708" w:footer="708" w:gutter="0"/>

</xml_diff>